<commit_message>
docs: update Project Deliverables Guide with phase mapping and corrected file names
- Added Phase Mapping table aligning course weeks to RE phases and deliverables
- Updated all file references to match phase-based naming
- Updated deliverable status summary with correct phase labels
- Removed stale "turn 99" references
- Confirmed Dual Phase architecture documented
- All key corrections from original roadmap documented
</commit_message>
<xml_diff>
--- a/project_deliverables/Phase2-5_Project-Deliverables-Guide.docx
+++ b/project_deliverables/Phase2-5_Project-Deliverables-Guide.docx
@@ -123,7 +123,7 @@
           <w:color w:val="000000"/>
           <w:sz w:val="24"/>
         </w:rPr>
-        <w:t>This guide maps the original 10 document roadmap to the actual deliverables produced in this repository. Documents 3 through 8 from the original roadmap have been consolidated into a single Master Document per the updated roadmap (turn 99).</w:t>
+        <w:t>This guide maps the original 10 document roadmap to the actual deliverables produced in this repository. Documents 3 through 8 from the original roadmap have been consolidated into a single Master Document per the updated roadmap.</w:t>
       </w:r>
     </w:p>
     <w:p>
@@ -334,7 +334,7 @@
                 <w:color w:val="000000"/>
                 <w:sz w:val="24"/>
               </w:rPr>
-              <w:t>Document 1: Elicitation &amp; Stakeholder Analysis (Section 2.1)</w:t>
+              <w:t>Phase 1: Elicitation &amp; Stakeholder Analysis (Section 2.1)</w:t>
             </w:r>
           </w:p>
         </w:tc>
@@ -394,7 +394,7 @@
                 <w:color w:val="000000"/>
                 <w:sz w:val="24"/>
               </w:rPr>
-              <w:t>project_deliverables/DOC 01 Elicitation and Stakeholder Analysis.docx</w:t>
+              <w:t>project_deliverables/Phase1_Elicitation and Stakeholder Analysis.docx</w:t>
             </w:r>
           </w:p>
         </w:tc>
@@ -456,7 +456,7 @@
                 <w:color w:val="000000"/>
                 <w:sz w:val="24"/>
               </w:rPr>
-              <w:t>Document 1: Elicitation &amp; Stakeholder Analysis (Sections 3 5)</w:t>
+              <w:t>Phase 1: Elicitation &amp; Stakeholder Analysis (Sections 3 5)</w:t>
             </w:r>
           </w:p>
         </w:tc>
@@ -516,7 +516,7 @@
                 <w:color w:val="000000"/>
                 <w:sz w:val="24"/>
               </w:rPr>
-              <w:t>project_deliverables/DOC 01 Elicitation and Stakeholder Analysis.docx</w:t>
+              <w:t>project_deliverables/Phase1_Elicitation and Stakeholder Analysis.docx</w:t>
             </w:r>
           </w:p>
         </w:tc>
@@ -578,7 +578,7 @@
                 <w:color w:val="000000"/>
                 <w:sz w:val="24"/>
               </w:rPr>
-              <w:t>Master Document: Part 1 (Sections 1 4)</w:t>
+              <w:t>Phase 2 5: Master Document Part 1 (SRS)</w:t>
             </w:r>
           </w:p>
         </w:tc>
@@ -638,7 +638,7 @@
                 <w:color w:val="000000"/>
                 <w:sz w:val="24"/>
               </w:rPr>
-              <w:t>project_deliverables/MASTER Requirements Specification Traceability Management.docx</w:t>
+              <w:t>project_deliverables/Phase2 5_SRS Traceability VV Management DB Design.docx</w:t>
             </w:r>
           </w:p>
         </w:tc>
@@ -700,7 +700,7 @@
                 <w:color w:val="000000"/>
                 <w:sz w:val="24"/>
               </w:rPr>
-              <w:t>Master Document: Part 2</w:t>
+              <w:t>Phase 2 5: Master Document Part 2 (RTM)</w:t>
             </w:r>
           </w:p>
         </w:tc>
@@ -760,7 +760,7 @@
                 <w:color w:val="000000"/>
                 <w:sz w:val="24"/>
               </w:rPr>
-              <w:t>project_deliverables/MASTER Requirements Specification Traceability Management.docx</w:t>
+              <w:t>project_deliverables/Phase2 5_SRS Traceability VV Management DB Design.docx</w:t>
             </w:r>
           </w:p>
         </w:tc>
@@ -822,7 +822,7 @@
                 <w:color w:val="000000"/>
                 <w:sz w:val="24"/>
               </w:rPr>
-              <w:t>Master Document: Part 3</w:t>
+              <w:t>Phase 2 5: Master Document Part 3 (V&amp;V)</w:t>
             </w:r>
           </w:p>
         </w:tc>
@@ -882,7 +882,7 @@
                 <w:color w:val="000000"/>
                 <w:sz w:val="24"/>
               </w:rPr>
-              <w:t>project_deliverables/MASTER Requirements Specification Traceability Management.docx</w:t>
+              <w:t>project_deliverables/Phase2 5_SRS Traceability VV Management DB Design.docx</w:t>
             </w:r>
           </w:p>
         </w:tc>
@@ -944,7 +944,7 @@
                 <w:color w:val="000000"/>
                 <w:sz w:val="24"/>
               </w:rPr>
-              <w:t>Master Document: Part 4</w:t>
+              <w:t>Phase 2 5: Master Document Part 4 (Management)</w:t>
             </w:r>
           </w:p>
         </w:tc>
@@ -1004,7 +1004,7 @@
                 <w:color w:val="000000"/>
                 <w:sz w:val="24"/>
               </w:rPr>
-              <w:t>project_deliverables/MASTER Requirements Specification Traceability Management.docx</w:t>
+              <w:t>project_deliverables/Phase2 5_SRS Traceability VV Management DB Design.docx</w:t>
             </w:r>
           </w:p>
         </w:tc>
@@ -1066,7 +1066,7 @@
                 <w:color w:val="000000"/>
                 <w:sz w:val="24"/>
               </w:rPr>
-              <w:t>Master Document: Part 5, Section 1</w:t>
+              <w:t>Phase 2 5: Master Document Part 5 Section 1 (DB Design)</w:t>
             </w:r>
           </w:p>
         </w:tc>
@@ -1126,7 +1126,7 @@
                 <w:color w:val="000000"/>
                 <w:sz w:val="24"/>
               </w:rPr>
-              <w:t>project_deliverables/MASTER Requirements Specification Traceability Management.docx</w:t>
+              <w:t>project_deliverables/Phase2 5_SRS Traceability VV Management DB Design.docx</w:t>
             </w:r>
           </w:p>
         </w:tc>
@@ -1188,7 +1188,7 @@
                 <w:color w:val="000000"/>
                 <w:sz w:val="24"/>
               </w:rPr>
-              <w:t>Master Document: Part 5, Sections 2 4</w:t>
+              <w:t>Phase 2 5: Master Document Part 5 Sections 2 4 (DB Design)</w:t>
             </w:r>
           </w:p>
         </w:tc>
@@ -1248,7 +1248,7 @@
                 <w:color w:val="000000"/>
                 <w:sz w:val="24"/>
               </w:rPr>
-              <w:t>project_deliverables/MASTER Requirements Specification Traceability Management.docx</w:t>
+              <w:t>project_deliverables/Phase2 5_SRS Traceability VV Management DB Design.docx</w:t>
             </w:r>
           </w:p>
         </w:tc>
@@ -1310,7 +1310,7 @@
                 <w:color w:val="000000"/>
                 <w:sz w:val="24"/>
               </w:rPr>
-              <w:t>Document 9: Grand Project Presentation Deck</w:t>
+              <w:t>Phase Final: Grand Project Presentation Deck</w:t>
             </w:r>
           </w:p>
         </w:tc>
@@ -1370,7 +1370,7 @@
                 <w:color w:val="000000"/>
                 <w:sz w:val="24"/>
               </w:rPr>
-              <w:t>project_deliverables/DOC 09 Grand Project Presentation.pptx</w:t>
+              <w:t>project_deliverables/PhaseFinal_Grand Project Presentation.pptx</w:t>
             </w:r>
           </w:p>
         </w:tc>
@@ -1514,6 +1514,614 @@
           <w:color w:val="000000"/>
           <w:sz w:val="24"/>
         </w:rPr>
+        <w:t>PHASE MAPPING</w:t>
+      </w:r>
+    </w:p>
+    <w:tbl>
+      <w:tblPr>
+        <w:tblStyle w:val="TableGrid"/>
+        <w:tblW w:type="auto" w:w="0"/>
+        <w:jc w:val="center"/>
+        <w:tblLook w:firstColumn="1" w:firstRow="1" w:lastColumn="0" w:lastRow="0" w:noHBand="0" w:noVBand="1" w:val="04A0"/>
+      </w:tblPr>
+      <w:tblGrid>
+        <w:gridCol w:w="2256"/>
+        <w:gridCol w:w="2256"/>
+        <w:gridCol w:w="2256"/>
+        <w:gridCol w:w="2256"/>
+      </w:tblGrid>
+      <w:tr>
+        <w:tc>
+          <w:tcPr>
+            <w:tcW w:type="dxa" w:w="2256"/>
+          </w:tcPr>
+          <w:p>
+            <w:pPr>
+              <w:spacing w:lineRule="auto" w:line="276" w:before="40" w:after="40"/>
+            </w:pPr>
+            <w:r/>
+            <w:r>
+              <w:rPr>
+                <w:rFonts w:ascii="Times New Roman" w:hAnsi="Times New Roman" w:cs="Times New Roman" w:eastAsia="Times New Roman"/>
+                <w:b/>
+                <w:color w:val="000000"/>
+                <w:sz w:val="24"/>
+              </w:rPr>
+              <w:t>Course Phase</w:t>
+            </w:r>
+          </w:p>
+        </w:tc>
+        <w:tc>
+          <w:tcPr>
+            <w:tcW w:type="dxa" w:w="2256"/>
+          </w:tcPr>
+          <w:p>
+            <w:pPr>
+              <w:spacing w:lineRule="auto" w:line="276" w:before="40" w:after="40"/>
+            </w:pPr>
+            <w:r/>
+            <w:r>
+              <w:rPr>
+                <w:rFonts w:ascii="Times New Roman" w:hAnsi="Times New Roman" w:cs="Times New Roman" w:eastAsia="Times New Roman"/>
+                <w:b/>
+                <w:color w:val="000000"/>
+                <w:sz w:val="24"/>
+              </w:rPr>
+              <w:t>RE Phase</w:t>
+            </w:r>
+          </w:p>
+        </w:tc>
+        <w:tc>
+          <w:tcPr>
+            <w:tcW w:type="dxa" w:w="2256"/>
+          </w:tcPr>
+          <w:p>
+            <w:pPr>
+              <w:spacing w:lineRule="auto" w:line="276" w:before="40" w:after="40"/>
+            </w:pPr>
+            <w:r/>
+            <w:r>
+              <w:rPr>
+                <w:rFonts w:ascii="Times New Roman" w:hAnsi="Times New Roman" w:cs="Times New Roman" w:eastAsia="Times New Roman"/>
+                <w:b/>
+                <w:color w:val="000000"/>
+                <w:sz w:val="24"/>
+              </w:rPr>
+              <w:t>Deliverables</w:t>
+            </w:r>
+          </w:p>
+        </w:tc>
+        <w:tc>
+          <w:tcPr>
+            <w:tcW w:type="dxa" w:w="2256"/>
+          </w:tcPr>
+          <w:p>
+            <w:pPr>
+              <w:spacing w:lineRule="auto" w:line="276" w:before="40" w:after="40"/>
+            </w:pPr>
+            <w:r/>
+            <w:r>
+              <w:rPr>
+                <w:rFonts w:ascii="Times New Roman" w:hAnsi="Times New Roman" w:cs="Times New Roman" w:eastAsia="Times New Roman"/>
+                <w:b/>
+                <w:color w:val="000000"/>
+                <w:sz w:val="24"/>
+              </w:rPr>
+              <w:t>Files</w:t>
+            </w:r>
+          </w:p>
+        </w:tc>
+      </w:tr>
+      <w:tr>
+        <w:tc>
+          <w:tcPr>
+            <w:tcW w:type="dxa" w:w="2256"/>
+          </w:tcPr>
+          <w:p>
+            <w:pPr>
+              <w:spacing w:lineRule="auto" w:line="276" w:before="40" w:after="40"/>
+            </w:pPr>
+            <w:r/>
+            <w:r>
+              <w:rPr>
+                <w:rFonts w:ascii="Times New Roman" w:hAnsi="Times New Roman" w:cs="Times New Roman" w:eastAsia="Times New Roman"/>
+                <w:b w:val="0"/>
+                <w:color w:val="000000"/>
+                <w:sz w:val="24"/>
+              </w:rPr>
+              <w:t>Week 2 (Sep 15)</w:t>
+            </w:r>
+          </w:p>
+        </w:tc>
+        <w:tc>
+          <w:tcPr>
+            <w:tcW w:type="dxa" w:w="2256"/>
+          </w:tcPr>
+          <w:p>
+            <w:pPr>
+              <w:spacing w:lineRule="auto" w:line="276" w:before="40" w:after="40"/>
+            </w:pPr>
+            <w:r/>
+            <w:r>
+              <w:rPr>
+                <w:rFonts w:ascii="Times New Roman" w:hAnsi="Times New Roman" w:cs="Times New Roman" w:eastAsia="Times New Roman"/>
+                <w:b w:val="0"/>
+                <w:color w:val="000000"/>
+                <w:sz w:val="24"/>
+              </w:rPr>
+              <w:t>Phase 1: Elicitation &amp; Stakeholder Analysis</w:t>
+            </w:r>
+          </w:p>
+        </w:tc>
+        <w:tc>
+          <w:tcPr>
+            <w:tcW w:type="dxa" w:w="2256"/>
+          </w:tcPr>
+          <w:p>
+            <w:pPr>
+              <w:spacing w:lineRule="auto" w:line="276" w:before="40" w:after="40"/>
+            </w:pPr>
+            <w:r/>
+            <w:r>
+              <w:rPr>
+                <w:rFonts w:ascii="Times New Roman" w:hAnsi="Times New Roman" w:cs="Times New Roman" w:eastAsia="Times New Roman"/>
+                <w:b w:val="0"/>
+                <w:color w:val="000000"/>
+                <w:sz w:val="24"/>
+              </w:rPr>
+              <w:t>Stakeholder Register, Power/Interest Matrix, Elicitation Report, Field Visit Log, Challenges &amp; Synthesis</w:t>
+            </w:r>
+          </w:p>
+        </w:tc>
+        <w:tc>
+          <w:tcPr>
+            <w:tcW w:type="dxa" w:w="2256"/>
+          </w:tcPr>
+          <w:p>
+            <w:pPr>
+              <w:spacing w:lineRule="auto" w:line="276" w:before="40" w:after="40"/>
+            </w:pPr>
+            <w:r/>
+            <w:r>
+              <w:rPr>
+                <w:rFonts w:ascii="Times New Roman" w:hAnsi="Times New Roman" w:cs="Times New Roman" w:eastAsia="Times New Roman"/>
+                <w:b w:val="0"/>
+                <w:color w:val="000000"/>
+                <w:sz w:val="24"/>
+              </w:rPr>
+              <w:t>Phase1_Elicitation and Stakeholder Analysis.docx</w:t>
+            </w:r>
+          </w:p>
+        </w:tc>
+      </w:tr>
+      <w:tr>
+        <w:tc>
+          <w:tcPr>
+            <w:tcW w:type="dxa" w:w="2256"/>
+          </w:tcPr>
+          <w:p>
+            <w:pPr>
+              <w:spacing w:lineRule="auto" w:line="276" w:before="40" w:after="40"/>
+            </w:pPr>
+            <w:r/>
+            <w:r>
+              <w:rPr>
+                <w:rFonts w:ascii="Times New Roman" w:hAnsi="Times New Roman" w:cs="Times New Roman" w:eastAsia="Times New Roman"/>
+                <w:b w:val="0"/>
+                <w:color w:val="000000"/>
+                <w:sz w:val="24"/>
+              </w:rPr>
+              <w:t>Weeks 3 4</w:t>
+            </w:r>
+          </w:p>
+        </w:tc>
+        <w:tc>
+          <w:tcPr>
+            <w:tcW w:type="dxa" w:w="2256"/>
+          </w:tcPr>
+          <w:p>
+            <w:pPr>
+              <w:spacing w:lineRule="auto" w:line="276" w:before="40" w:after="40"/>
+            </w:pPr>
+            <w:r/>
+            <w:r>
+              <w:rPr>
+                <w:rFonts w:ascii="Times New Roman" w:hAnsi="Times New Roman" w:cs="Times New Roman" w:eastAsia="Times New Roman"/>
+                <w:b w:val="0"/>
+                <w:color w:val="000000"/>
+                <w:sz w:val="24"/>
+              </w:rPr>
+              <w:t>Phase 2 &amp; 3: Analysis &amp; Specification</w:t>
+            </w:r>
+          </w:p>
+        </w:tc>
+        <w:tc>
+          <w:tcPr>
+            <w:tcW w:type="dxa" w:w="2256"/>
+          </w:tcPr>
+          <w:p>
+            <w:pPr>
+              <w:spacing w:lineRule="auto" w:line="276" w:before="40" w:after="40"/>
+            </w:pPr>
+            <w:r/>
+            <w:r>
+              <w:rPr>
+                <w:rFonts w:ascii="Times New Roman" w:hAnsi="Times New Roman" w:cs="Times New Roman" w:eastAsia="Times New Roman"/>
+                <w:b w:val="0"/>
+                <w:color w:val="000000"/>
+                <w:sz w:val="24"/>
+              </w:rPr>
+              <w:t>SRS (IEEE 830), Functional &amp; Non Functional Requirements, Use Cases, RTM</w:t>
+            </w:r>
+          </w:p>
+        </w:tc>
+        <w:tc>
+          <w:tcPr>
+            <w:tcW w:type="dxa" w:w="2256"/>
+          </w:tcPr>
+          <w:p>
+            <w:pPr>
+              <w:spacing w:lineRule="auto" w:line="276" w:before="40" w:after="40"/>
+            </w:pPr>
+            <w:r/>
+            <w:r>
+              <w:rPr>
+                <w:rFonts w:ascii="Times New Roman" w:hAnsi="Times New Roman" w:cs="Times New Roman" w:eastAsia="Times New Roman"/>
+                <w:b w:val="0"/>
+                <w:color w:val="000000"/>
+                <w:sz w:val="24"/>
+              </w:rPr>
+              <w:t>Phase2 5_SRS Traceability VV Management DB Design.docx (Parts 1 2)</w:t>
+            </w:r>
+          </w:p>
+        </w:tc>
+      </w:tr>
+      <w:tr>
+        <w:tc>
+          <w:tcPr>
+            <w:tcW w:type="dxa" w:w="2256"/>
+          </w:tcPr>
+          <w:p>
+            <w:pPr>
+              <w:spacing w:lineRule="auto" w:line="276" w:before="40" w:after="40"/>
+            </w:pPr>
+            <w:r/>
+            <w:r>
+              <w:rPr>
+                <w:rFonts w:ascii="Times New Roman" w:hAnsi="Times New Roman" w:cs="Times New Roman" w:eastAsia="Times New Roman"/>
+                <w:b w:val="0"/>
+                <w:color w:val="000000"/>
+                <w:sz w:val="24"/>
+              </w:rPr>
+              <w:t>Weeks 5 6</w:t>
+            </w:r>
+          </w:p>
+        </w:tc>
+        <w:tc>
+          <w:tcPr>
+            <w:tcW w:type="dxa" w:w="2256"/>
+          </w:tcPr>
+          <w:p>
+            <w:pPr>
+              <w:spacing w:lineRule="auto" w:line="276" w:before="40" w:after="40"/>
+            </w:pPr>
+            <w:r/>
+            <w:r>
+              <w:rPr>
+                <w:rFonts w:ascii="Times New Roman" w:hAnsi="Times New Roman" w:cs="Times New Roman" w:eastAsia="Times New Roman"/>
+                <w:b w:val="0"/>
+                <w:color w:val="000000"/>
+                <w:sz w:val="24"/>
+              </w:rPr>
+              <w:t>Phase 4 &amp; 5: Validation &amp; Management</w:t>
+            </w:r>
+          </w:p>
+        </w:tc>
+        <w:tc>
+          <w:tcPr>
+            <w:tcW w:type="dxa" w:w="2256"/>
+          </w:tcPr>
+          <w:p>
+            <w:pPr>
+              <w:spacing w:lineRule="auto" w:line="276" w:before="40" w:after="40"/>
+            </w:pPr>
+            <w:r/>
+            <w:r>
+              <w:rPr>
+                <w:rFonts w:ascii="Times New Roman" w:hAnsi="Times New Roman" w:cs="Times New Roman" w:eastAsia="Times New Roman"/>
+                <w:b w:val="0"/>
+                <w:color w:val="000000"/>
+                <w:sz w:val="24"/>
+              </w:rPr>
+              <w:t>V&amp;V Plan, Requirements Management Plan, Change Control, Version Control</w:t>
+            </w:r>
+          </w:p>
+        </w:tc>
+        <w:tc>
+          <w:tcPr>
+            <w:tcW w:type="dxa" w:w="2256"/>
+          </w:tcPr>
+          <w:p>
+            <w:pPr>
+              <w:spacing w:lineRule="auto" w:line="276" w:before="40" w:after="40"/>
+            </w:pPr>
+            <w:r/>
+            <w:r>
+              <w:rPr>
+                <w:rFonts w:ascii="Times New Roman" w:hAnsi="Times New Roman" w:cs="Times New Roman" w:eastAsia="Times New Roman"/>
+                <w:b w:val="0"/>
+                <w:color w:val="000000"/>
+                <w:sz w:val="24"/>
+              </w:rPr>
+              <w:t>Phase2 5_SRS Traceability VV Management DB Design.docx (Parts 3 4)</w:t>
+            </w:r>
+          </w:p>
+        </w:tc>
+      </w:tr>
+      <w:tr>
+        <w:tc>
+          <w:tcPr>
+            <w:tcW w:type="dxa" w:w="2256"/>
+          </w:tcPr>
+          <w:p>
+            <w:pPr>
+              <w:spacing w:lineRule="auto" w:line="276" w:before="40" w:after="40"/>
+            </w:pPr>
+            <w:r/>
+            <w:r>
+              <w:rPr>
+                <w:rFonts w:ascii="Times New Roman" w:hAnsi="Times New Roman" w:cs="Times New Roman" w:eastAsia="Times New Roman"/>
+                <w:b w:val="0"/>
+                <w:color w:val="000000"/>
+                <w:sz w:val="24"/>
+              </w:rPr>
+              <w:t>SWE1205</w:t>
+            </w:r>
+          </w:p>
+        </w:tc>
+        <w:tc>
+          <w:tcPr>
+            <w:tcW w:type="dxa" w:w="2256"/>
+          </w:tcPr>
+          <w:p>
+            <w:pPr>
+              <w:spacing w:lineRule="auto" w:line="276" w:before="40" w:after="40"/>
+            </w:pPr>
+            <w:r/>
+            <w:r>
+              <w:rPr>
+                <w:rFonts w:ascii="Times New Roman" w:hAnsi="Times New Roman" w:cs="Times New Roman" w:eastAsia="Times New Roman"/>
+                <w:b w:val="0"/>
+                <w:color w:val="000000"/>
+                <w:sz w:val="24"/>
+              </w:rPr>
+              <w:t>Database &amp; System Design</w:t>
+            </w:r>
+          </w:p>
+        </w:tc>
+        <w:tc>
+          <w:tcPr>
+            <w:tcW w:type="dxa" w:w="2256"/>
+          </w:tcPr>
+          <w:p>
+            <w:pPr>
+              <w:spacing w:lineRule="auto" w:line="276" w:before="40" w:after="40"/>
+            </w:pPr>
+            <w:r/>
+            <w:r>
+              <w:rPr>
+                <w:rFonts w:ascii="Times New Roman" w:hAnsi="Times New Roman" w:cs="Times New Roman" w:eastAsia="Times New Roman"/>
+                <w:b w:val="0"/>
+                <w:color w:val="000000"/>
+                <w:sz w:val="24"/>
+              </w:rPr>
+              <w:t>ER Diagram, Data Dictionary, Stored Procedures, Triggers, Views</w:t>
+            </w:r>
+          </w:p>
+        </w:tc>
+        <w:tc>
+          <w:tcPr>
+            <w:tcW w:type="dxa" w:w="2256"/>
+          </w:tcPr>
+          <w:p>
+            <w:pPr>
+              <w:spacing w:lineRule="auto" w:line="276" w:before="40" w:after="40"/>
+            </w:pPr>
+            <w:r/>
+            <w:r>
+              <w:rPr>
+                <w:rFonts w:ascii="Times New Roman" w:hAnsi="Times New Roman" w:cs="Times New Roman" w:eastAsia="Times New Roman"/>
+                <w:b w:val="0"/>
+                <w:color w:val="000000"/>
+                <w:sz w:val="24"/>
+              </w:rPr>
+              <w:t>Phase2 5_SRS Traceability VV Management DB Design.docx (Part 5)</w:t>
+            </w:r>
+          </w:p>
+        </w:tc>
+      </w:tr>
+      <w:tr>
+        <w:tc>
+          <w:tcPr>
+            <w:tcW w:type="dxa" w:w="2256"/>
+          </w:tcPr>
+          <w:p>
+            <w:pPr>
+              <w:spacing w:lineRule="auto" w:line="276" w:before="40" w:after="40"/>
+            </w:pPr>
+            <w:r/>
+            <w:r>
+              <w:rPr>
+                <w:rFonts w:ascii="Times New Roman" w:hAnsi="Times New Roman" w:cs="Times New Roman" w:eastAsia="Times New Roman"/>
+                <w:b w:val="0"/>
+                <w:color w:val="000000"/>
+                <w:sz w:val="24"/>
+              </w:rPr>
+              <w:t>End of Semester</w:t>
+            </w:r>
+          </w:p>
+        </w:tc>
+        <w:tc>
+          <w:tcPr>
+            <w:tcW w:type="dxa" w:w="2256"/>
+          </w:tcPr>
+          <w:p>
+            <w:pPr>
+              <w:spacing w:lineRule="auto" w:line="276" w:before="40" w:after="40"/>
+            </w:pPr>
+            <w:r/>
+            <w:r>
+              <w:rPr>
+                <w:rFonts w:ascii="Times New Roman" w:hAnsi="Times New Roman" w:cs="Times New Roman" w:eastAsia="Times New Roman"/>
+                <w:b w:val="0"/>
+                <w:color w:val="000000"/>
+                <w:sz w:val="24"/>
+              </w:rPr>
+              <w:t>Phase Final: Grand Presentation</w:t>
+            </w:r>
+          </w:p>
+        </w:tc>
+        <w:tc>
+          <w:tcPr>
+            <w:tcW w:type="dxa" w:w="2256"/>
+          </w:tcPr>
+          <w:p>
+            <w:pPr>
+              <w:spacing w:lineRule="auto" w:line="276" w:before="40" w:after="40"/>
+            </w:pPr>
+            <w:r/>
+            <w:r>
+              <w:rPr>
+                <w:rFonts w:ascii="Times New Roman" w:hAnsi="Times New Roman" w:cs="Times New Roman" w:eastAsia="Times New Roman"/>
+                <w:b w:val="0"/>
+                <w:color w:val="000000"/>
+                <w:sz w:val="24"/>
+              </w:rPr>
+              <w:t>Presentation Deck, User Manual / SOP</w:t>
+            </w:r>
+          </w:p>
+        </w:tc>
+        <w:tc>
+          <w:tcPr>
+            <w:tcW w:type="dxa" w:w="2256"/>
+          </w:tcPr>
+          <w:p>
+            <w:pPr>
+              <w:spacing w:lineRule="auto" w:line="276" w:before="40" w:after="40"/>
+            </w:pPr>
+            <w:r/>
+            <w:r>
+              <w:rPr>
+                <w:rFonts w:ascii="Times New Roman" w:hAnsi="Times New Roman" w:cs="Times New Roman" w:eastAsia="Times New Roman"/>
+                <w:b w:val="0"/>
+                <w:color w:val="000000"/>
+                <w:sz w:val="24"/>
+              </w:rPr>
+              <w:t>PhaseFinal_Grand Project Presentation.pptx + Doc 10 (pending)</w:t>
+            </w:r>
+          </w:p>
+        </w:tc>
+      </w:tr>
+      <w:tr>
+        <w:tc>
+          <w:tcPr>
+            <w:tcW w:type="dxa" w:w="2256"/>
+          </w:tcPr>
+          <w:p>
+            <w:pPr>
+              <w:spacing w:lineRule="auto" w:line="276" w:before="40" w:after="40"/>
+            </w:pPr>
+            <w:r/>
+            <w:r>
+              <w:rPr>
+                <w:rFonts w:ascii="Times New Roman" w:hAnsi="Times New Roman" w:cs="Times New Roman" w:eastAsia="Times New Roman"/>
+                <w:b w:val="0"/>
+                <w:color w:val="000000"/>
+                <w:sz w:val="24"/>
+              </w:rPr>
+              <w:t>Ongoing</w:t>
+            </w:r>
+          </w:p>
+        </w:tc>
+        <w:tc>
+          <w:tcPr>
+            <w:tcW w:type="dxa" w:w="2256"/>
+          </w:tcPr>
+          <w:p>
+            <w:pPr>
+              <w:spacing w:lineRule="auto" w:line="276" w:before="40" w:after="40"/>
+            </w:pPr>
+            <w:r/>
+            <w:r>
+              <w:rPr>
+                <w:rFonts w:ascii="Times New Roman" w:hAnsi="Times New Roman" w:cs="Times New Roman" w:eastAsia="Times New Roman"/>
+                <w:b w:val="0"/>
+                <w:color w:val="000000"/>
+                <w:sz w:val="24"/>
+              </w:rPr>
+              <w:t>Reference</w:t>
+            </w:r>
+          </w:p>
+        </w:tc>
+        <w:tc>
+          <w:tcPr>
+            <w:tcW w:type="dxa" w:w="2256"/>
+          </w:tcPr>
+          <w:p>
+            <w:pPr>
+              <w:spacing w:lineRule="auto" w:line="276" w:before="40" w:after="40"/>
+            </w:pPr>
+            <w:r/>
+            <w:r>
+              <w:rPr>
+                <w:rFonts w:ascii="Times New Roman" w:hAnsi="Times New Roman" w:cs="Times New Roman" w:eastAsia="Times New Roman"/>
+                <w:b w:val="0"/>
+                <w:color w:val="000000"/>
+                <w:sz w:val="24"/>
+              </w:rPr>
+              <w:t>Project Deliverables Guide</w:t>
+            </w:r>
+          </w:p>
+        </w:tc>
+        <w:tc>
+          <w:tcPr>
+            <w:tcW w:type="dxa" w:w="2256"/>
+          </w:tcPr>
+          <w:p>
+            <w:pPr>
+              <w:spacing w:lineRule="auto" w:line="276" w:before="40" w:after="40"/>
+            </w:pPr>
+            <w:r/>
+            <w:r>
+              <w:rPr>
+                <w:rFonts w:ascii="Times New Roman" w:hAnsi="Times New Roman" w:cs="Times New Roman" w:eastAsia="Times New Roman"/>
+                <w:b w:val="0"/>
+                <w:color w:val="000000"/>
+                <w:sz w:val="24"/>
+              </w:rPr>
+              <w:t>Phase2 5_Project Deliverables Guide.docx</w:t>
+            </w:r>
+          </w:p>
+        </w:tc>
+      </w:tr>
+    </w:tbl>
+    <w:p>
+      <w:pPr>
+        <w:spacing w:lineRule="auto" w:line="276" w:before="0" w:after="160"/>
+      </w:pPr>
+      <w:r/>
+    </w:p>
+    <w:p>
+      <w:pPr>
+        <w:spacing w:lineRule="auto" w:line="276" w:before="240" w:after="120"/>
+      </w:pPr>
+      <w:r>
+        <w:rPr>
+          <w:rFonts w:ascii="Times New Roman" w:hAnsi="Times New Roman" w:cs="Times New Roman" w:eastAsia="Times New Roman"/>
+          <w:b/>
+          <w:color w:val="000000"/>
+          <w:sz w:val="24"/>
+        </w:rPr>
         <w:t>CONSOLIDATION NOTE</w:t>
       </w:r>
     </w:p>
@@ -1528,7 +2136,7 @@
           <w:color w:val="000000"/>
           <w:sz w:val="24"/>
         </w:rPr>
-        <w:t>Per the corrected roadmap (turn 99), Documents 3 through 8 from the original roadmap have been consolidated into a single Master Document to avoid fragmentation and ensure strict traceability between requirements, traceability matrix, validation, management, and database design. This master document is the single source of truth for Phases 2 through 5 and the SWE1205 database deliverable.</w:t>
+        <w:t>Per the corrected roadmap, Documents 3 through 8 from the original roadmap have been consolidated into a single Master Document to avoid fragmentation and ensure strict traceability between requirements, traceability matrix, validation, management, and database design. This master document is the single source of truth for Phases 2 through 5 and the SWE1205 database deliverable.</w:t>
       </w:r>
     </w:p>
     <w:p>
@@ -2156,7 +2764,7 @@
                 <w:color w:val="000000"/>
                 <w:sz w:val="24"/>
               </w:rPr>
-              <w:t>DOC 01 Elicitation and Stakeholder Analysis.docx</w:t>
+              <w:t>Phase1_Elicitation and Stakeholder Analysis.docx</w:t>
             </w:r>
           </w:p>
         </w:tc>
@@ -2176,7 +2784,7 @@
                 <w:color w:val="000000"/>
                 <w:sz w:val="24"/>
               </w:rPr>
-              <w:t>Document 1: Phase 1 strict (As Is, gaps, synthesis)</w:t>
+              <w:t>Phase 1: Elicitation &amp; Stakeholder Analysis</w:t>
             </w:r>
           </w:p>
         </w:tc>
@@ -2198,7 +2806,7 @@
                 <w:color w:val="000000"/>
                 <w:sz w:val="24"/>
               </w:rPr>
-              <w:t>MASTER Requirements Specification Traceability Management.docx</w:t>
+              <w:t>Phase2 5_SRS Traceability VV Management DB Design.docx</w:t>
             </w:r>
           </w:p>
         </w:tc>
@@ -2218,7 +2826,7 @@
                 <w:color w:val="000000"/>
                 <w:sz w:val="24"/>
               </w:rPr>
-              <w:t>Master: SRS + RTM + V&amp;V + Management + DB Design</w:t>
+              <w:t>Phases 2 5: SRS + RTM + V&amp;V + Management + DB Design</w:t>
             </w:r>
           </w:p>
         </w:tc>
@@ -2240,7 +2848,7 @@
                 <w:color w:val="000000"/>
                 <w:sz w:val="24"/>
               </w:rPr>
-              <w:t>DOC 09 Grand Project Presentation.pptx</w:t>
+              <w:t>Phase2 5_Project Deliverables Guide.docx</w:t>
             </w:r>
           </w:p>
         </w:tc>
@@ -2260,7 +2868,7 @@
                 <w:color w:val="000000"/>
                 <w:sz w:val="24"/>
               </w:rPr>
-              <w:t>Document 9: Grand Project Presentation Deck (PPTX)</w:t>
+              <w:t>Project Deliverables Guide (this document)</w:t>
             </w:r>
           </w:p>
         </w:tc>
@@ -2282,7 +2890,7 @@
                 <w:color w:val="000000"/>
                 <w:sz w:val="24"/>
               </w:rPr>
-              <w:t>DOC 09 Grand Project Presentation Deck.docx</w:t>
+              <w:t>PhaseFinal_Grand Project Presentation.pptx</w:t>
             </w:r>
           </w:p>
         </w:tc>
@@ -2302,7 +2910,7 @@
                 <w:color w:val="000000"/>
                 <w:sz w:val="24"/>
               </w:rPr>
-              <w:t>Document 9: Grand Project Presentation Deck (DOCX backup)</w:t>
+              <w:t>Phase Final: Grand Project Presentation Deck (PPTX)</w:t>
             </w:r>
           </w:p>
         </w:tc>
@@ -2324,7 +2932,7 @@
                 <w:color w:val="000000"/>
                 <w:sz w:val="24"/>
               </w:rPr>
-              <w:t>MASTER Requirements Specification Traceability Management.docx</w:t>
+              <w:t>PhaseFinal_Grand Project Presentation Backup.docx</w:t>
             </w:r>
           </w:p>
         </w:tc>
@@ -2344,49 +2952,7 @@
                 <w:color w:val="000000"/>
                 <w:sz w:val="24"/>
               </w:rPr>
-              <w:t>Master: SRS + RTM + V&amp;V + Management + DB Design</w:t>
-            </w:r>
-          </w:p>
-        </w:tc>
-      </w:tr>
-      <w:tr>
-        <w:tc>
-          <w:tcPr>
-            <w:tcW w:type="dxa" w:w="4513"/>
-          </w:tcPr>
-          <w:p>
-            <w:pPr>
-              <w:spacing w:lineRule="auto" w:line="276" w:before="40" w:after="40"/>
-            </w:pPr>
-            <w:r/>
-            <w:r>
-              <w:rPr>
-                <w:rFonts w:ascii="Times New Roman" w:hAnsi="Times New Roman" w:cs="Times New Roman" w:eastAsia="Times New Roman"/>
-                <w:b w:val="0"/>
-                <w:color w:val="000000"/>
-                <w:sz w:val="24"/>
-              </w:rPr>
-              <w:t>PROJECT DELIVERABLES GUIDE.docx</w:t>
-            </w:r>
-          </w:p>
-        </w:tc>
-        <w:tc>
-          <w:tcPr>
-            <w:tcW w:type="dxa" w:w="4513"/>
-          </w:tcPr>
-          <w:p>
-            <w:pPr>
-              <w:spacing w:lineRule="auto" w:line="276" w:before="40" w:after="40"/>
-            </w:pPr>
-            <w:r/>
-            <w:r>
-              <w:rPr>
-                <w:rFonts w:ascii="Times New Roman" w:hAnsi="Times New Roman" w:cs="Times New Roman" w:eastAsia="Times New Roman"/>
-                <w:b w:val="0"/>
-                <w:color w:val="000000"/>
-                <w:sz w:val="24"/>
-              </w:rPr>
-              <w:t>Project Deliverables Guide</w:t>
+              <w:t>Phase Final: Grand Project Presentation Deck (DOCX backup)</w:t>
             </w:r>
           </w:p>
         </w:tc>
@@ -2428,7 +2994,7 @@
                 <w:color w:val="000000"/>
                 <w:sz w:val="24"/>
               </w:rPr>
-              <w:t>Full 100 turn fact base with dual phase design</w:t>
+              <w:t>Full fact base with dual phase design</w:t>
             </w:r>
           </w:p>
         </w:tc>
@@ -2470,7 +3036,7 @@
                 <w:color w:val="000000"/>
                 <w:sz w:val="24"/>
               </w:rPr>
-              <w:t>Document 1 source spec</w:t>
+              <w:t>Phase 1 source spec</w:t>
             </w:r>
           </w:p>
         </w:tc>
@@ -2512,7 +3078,7 @@
                 <w:color w:val="000000"/>
                 <w:sz w:val="24"/>
               </w:rPr>
-              <w:t>Master document source spec</w:t>
+              <w:t>Master document source spec (Phases 2 5 + DB)</w:t>
             </w:r>
           </w:p>
         </w:tc>

</xml_diff>